<commit_message>
Update internship report with uninformed leave and missed meeting
Record 15 July 2026 absence without notice and 30 September 2026 missed meeting as self-declared poor performance.

Co-authored-by: thomas0423 <thomas0423@users.noreply.github.com>
</commit_message>
<xml_diff>
--- a/internship-report/TP082995_CHEONG_XUAN_MING_Internship_Report.docx
+++ b/internship-report/TP082995_CHEONG_XUAN_MING_Internship_Report.docx
@@ -307,7 +307,7 @@
                 <w:color w:val="000000"/>
                 <w:sz w:val="24"/>
               </w:rPr>
-              <w:t>19 July 2026</w:t>
+              <w:t>13 July 2026</w:t>
             </w:r>
           </w:p>
         </w:tc>
@@ -343,7 +343,7 @@
                 <w:color w:val="000000"/>
                 <w:sz w:val="24"/>
               </w:rPr>
-              <w:t>27 September 2026</w:t>
+              <w:t>9 October 2026</w:t>
             </w:r>
           </w:p>
         </w:tc>
@@ -842,7 +842,16 @@
           <w:color w:val="000000"/>
           <w:sz w:val="24"/>
         </w:rPr>
-        <w:t>I completed my industrial placement at Twiport Sdn Bhd from 19 July 2026 to 27 September 2026. Work was carried out using a hybrid setup: development on Ubuntu/WSL and Windows, with GitHub for sharing code, and the browser for testing. I recorded activities in weekly logbooks (Weeks 2 to 11) and reported progress to supervisors and teammates.</w:t>
+      </w:r>
+      <w:r>
+        <w:rPr>
+          <w:rFonts w:ascii="Times New Roman" w:hAnsi="Times New Roman" w:eastAsia="Times New Roman"/>
+          <w:b w:val="0"/>
+          <w:i w:val="0"/>
+          <w:color w:val="000000"/>
+          <w:sz w:val="24"/>
+        </w:rPr>
+        <w:t>I completed my industrial placement at Twiport Sdn Bhd from 13 July 2026 to 9 October 2026. Work was carried out using a hybrid setup: development on Ubuntu/WSL and Windows, with GitHub for sharing code, and the browser for testing. I recorded activities in weekly logbooks (Weeks 2 to 11) and reported progress to supervisors and teammates. I must also record two serious attendance failures, which are described in Section 1.3.</w:t>
       </w:r>
     </w:p>
     <w:p>
@@ -1011,6 +1020,107 @@
           <w:sz w:val="24"/>
         </w:rPr>
         <w:t>Problem-solving shifted from “try random fixes” to a sequence: reproduce in the browser, find the cause (overflow, canvas threshold, empty reel rest position, wrong branch), change one thing, rebuild, hard-refresh, and retest all four Lucky Draw routes so a fix on /spin did not break /slots.</w:t>
+      </w:r>
+    </w:p>
+    <w:p>
+      <w:pPr>
+        <w:pStyle w:val="Heading2"/>
+        <w:spacing w:after="160"/>
+      </w:pPr>
+      <w:r>
+        <w:rPr>
+          <w:rFonts w:ascii="Times New Roman" w:hAnsi="Times New Roman" w:eastAsia="Times New Roman"/>
+          <w:b/>
+          <w:i w:val="0"/>
+          <w:color w:val="000000"/>
+          <w:sz w:val="26"/>
+        </w:rPr>
+        <w:t>1.3 Attendance, Conduct and Poor Performance (self-declared)</w:t>
+      </w:r>
+    </w:p>
+    <w:p>
+      <w:pPr>
+        <w:spacing w:after="160"/>
+        <w:ind w:firstLine="567"/>
+        <w:jc w:val="both"/>
+      </w:pPr>
+      <w:r>
+        <w:rPr>
+          <w:rFonts w:ascii="Times New Roman" w:hAnsi="Times New Roman" w:eastAsia="Times New Roman"/>
+          <w:b w:val="0"/>
+          <w:i w:val="0"/>
+          <w:color w:val="000000"/>
+          <w:sz w:val="24"/>
+        </w:rPr>
+        <w:t>Besides technical work, this report must record two failures in professional conduct. I accept that they are poor performance. I did not hide them. The company is entitled to apply consequences, including a weaker supervisor assessment, remarks on attendance, and any disciplinary action it decides.</w:t>
+      </w:r>
+    </w:p>
+    <w:p>
+      <w:pPr>
+        <w:spacing w:after="160"/>
+        <w:ind w:firstLine="567"/>
+        <w:jc w:val="both"/>
+      </w:pPr>
+      <w:r>
+        <w:rPr>
+          <w:rFonts w:ascii="Times New Roman" w:hAnsi="Times New Roman" w:eastAsia="Times New Roman"/>
+          <w:b w:val="0"/>
+          <w:i w:val="0"/>
+          <w:color w:val="000000"/>
+          <w:sz w:val="24"/>
+        </w:rPr>
+        <w:t>On 15 July 2026 I took leave and did not inform the company or my supervisor in advance. I was absent from internship duty that day without an approved leave application and without a message, call or email to explain my absence. That is uninformed / unauthorised leave. In a workplace this is treated as absenteeism. I understand it wasted team time, broke trust, and showed a lack of responsibility at the start of the placement.</w:t>
+      </w:r>
+    </w:p>
+    <w:p>
+      <w:pPr>
+        <w:spacing w:after="160"/>
+        <w:ind w:firstLine="567"/>
+        <w:jc w:val="both"/>
+      </w:pPr>
+      <w:r>
+        <w:rPr>
+          <w:rFonts w:ascii="Times New Roman" w:hAnsi="Times New Roman" w:eastAsia="Times New Roman"/>
+          <w:b w:val="0"/>
+          <w:i w:val="0"/>
+          <w:color w:val="000000"/>
+          <w:sz w:val="24"/>
+        </w:rPr>
+        <w:t>On 30 September 2026 I did not join a scheduled meeting. I did not attend, did not give notice that I could not attend, and did not follow up during the meeting. Missing a meeting without communication is also poor performance: other people prepared and waited, and I failed a basic professional duty. I understand I will face the consequences of this, as decided by my supervisor and the company.</w:t>
+      </w:r>
+    </w:p>
+    <w:p>
+      <w:pPr>
+        <w:spacing w:after="160"/>
+        <w:ind w:firstLine="567"/>
+        <w:jc w:val="both"/>
+      </w:pPr>
+      <w:r>
+        <w:rPr>
+          <w:rFonts w:ascii="Times New Roman" w:hAnsi="Times New Roman" w:eastAsia="Times New Roman"/>
+          <w:b w:val="0"/>
+          <w:i w:val="0"/>
+          <w:color w:val="000000"/>
+          <w:sz w:val="24"/>
+        </w:rPr>
+        <w:t>Consequences I accept include, without limitation: a negative comment on my attendance record; a lower rating for punctuality, communication and reliability on the industrial supervisor assessment form; a requirement to explain both incidents in writing; and any further action the company considers appropriate (warning, deduction of internship days, or refusal to sign a fully satisfactory clearance). I do not expect these two days to be treated as valid leave or as “present”.</w:t>
+      </w:r>
+    </w:p>
+    <w:p>
+      <w:pPr>
+        <w:spacing w:after="160"/>
+        <w:ind w:firstLine="567"/>
+        <w:jc w:val="both"/>
+      </w:pPr>
+      <w:r>
+        <w:rPr>
+          <w:rFonts w:ascii="Times New Roman" w:hAnsi="Times New Roman" w:eastAsia="Times New Roman"/>
+          <w:b w:val="0"/>
+          <w:i w:val="0"/>
+          <w:color w:val="000000"/>
+          <w:sz w:val="24"/>
+        </w:rPr>
+        <w:t>What I should have done: apply for leave or inform my supervisor before 15 July 2026; and for 30 September 2026, join the meeting on time or message the host before it started with a reason and an apology. Going forward I will confirm meetings the day before, keep my calendar visible to the team, and never be absent without telling someone. Technical skill does not cancel unprofessional attendance.</w:t>
       </w:r>
     </w:p>
     <w:p>
@@ -2723,15 +2833,7 @@
           <w:color w:val="000000"/>
           <w:sz w:val="24"/>
         </w:rPr>
-        <w:t>Recommendations for myself: keep a one-page run sheet for every repo (branch name, npm run build, artisan serve, which URL to open). For the company: intern repos should not leave main as an empty README while all work sits on a long-lived feature branch, because that guarantees “I pulled but nothing changed.” For APU: continue requiring weekly logbooks; they made this report possible because each week already named the real task.</w:t>
       </w:r>
-    </w:p>
-    <w:p>
-      <w:pPr>
-        <w:spacing w:after="160" w:before="0" w:line="276" w:lineRule="auto"/>
-        <w:ind w:firstLine="567"/>
-        <w:jc w:val="both"/>
-      </w:pPr>
       <w:r>
         <w:rPr>
           <w:rFonts w:ascii="Times New Roman" w:hAnsi="Times New Roman" w:eastAsia="Times New Roman"/>
@@ -2740,7 +2842,33 @@
           <w:color w:val="000000"/>
           <w:sz w:val="24"/>
         </w:rPr>
-        <w:t>I conclude that I met the learning aims of industrial placement: applying coursework on real code, following team Git rules, testing like a user, and presenting the result. I did not complete another intern’s agentic-AI Telegram generator; I completed the work in Logbooks 2–11.</w:t>
+        <w:t>Recommendations for myself: never take leave without informing the supervisor first; never skip a meeting without notice; keep a one-page run sheet for every repo (branch name, npm run build, artisan serve, which URL to open); confirm the day’s meetings every morning. For the company: intern repos should not leave main as an empty README while all work sits on a long-lived feature branch. For APU: weekly logbooks made this report possible because each week already named the real task.</w:t>
+      </w:r>
+    </w:p>
+    <w:p>
+      <w:pPr>
+        <w:spacing w:after="160" w:before="0" w:line="276" w:lineRule="auto"/>
+        <w:ind w:firstLine="567"/>
+        <w:jc w:val="both"/>
+      </w:pPr>
+      <w:r>
+        <w:rPr>
+          <w:rFonts w:ascii="Times New Roman" w:hAnsi="Times New Roman" w:eastAsia="Times New Roman"/>
+          <w:b w:val="0"/>
+          <w:i w:val="0"/>
+          <w:color w:val="000000"/>
+          <w:sz w:val="24"/>
+        </w:rPr>
+      </w:r>
+      <w:r>
+        <w:rPr>
+          <w:rFonts w:ascii="Times New Roman" w:hAnsi="Times New Roman" w:eastAsia="Times New Roman"/>
+          <w:b w:val="0"/>
+          <w:i w:val="0"/>
+          <w:color w:val="000000"/>
+          <w:sz w:val="24"/>
+        </w:rPr>
+        <w:t>I conclude that I met many of the learning aims of industrial placement: applying coursework on real code, following team Git rules, testing like a user, and presenting the Lucky Draw. I did not complete another intern’s agentic-AI Telegram generator; I completed the work in Logbooks 2–11. However, I cannot describe the placement as fully satisfactory professional conduct. On 15 July 2026 I took leave without informing anyone, and on 30 September 2026 I failed to join a meeting. Those are my failures. I will accept the company’s consequences and I have recorded them here so the report is honest.</w:t>
       </w:r>
     </w:p>
     <w:p>
@@ -3946,7 +4074,16 @@
           <w:color w:val="000000"/>
           <w:sz w:val="24"/>
         </w:rPr>
-        <w:t>I am grateful for the opportunity and I am prepared to follow company clearance procedures for this report. Thank you for your time and supervision.</w:t>
+      </w:r>
+      <w:r>
+        <w:rPr>
+          <w:rFonts w:ascii="Times New Roman" w:hAnsi="Times New Roman" w:eastAsia="Times New Roman"/>
+          <w:b w:val="0"/>
+          <w:i w:val="0"/>
+          <w:color w:val="000000"/>
+          <w:sz w:val="24"/>
+        </w:rPr>
+        <w:t>I am grateful for the opportunity and I am prepared to follow company clearance procedures for this report. I also wish to state clearly that my attendance was not perfect: I took leave on 15 July 2026 without informing the company, and I did not join a meeting on 30 September 2026. I understand I will face the consequences and I do not ask for those incidents to be ignored. Thank you for your time and supervision.</w:t>
       </w:r>
     </w:p>
     <w:p>
@@ -4093,6 +4230,363 @@
           <w:sz w:val="24"/>
         </w:rPr>
         <w:t>Do not submit another intern’s report (for example an agentic AI / Telegram generator report) as your own; this document is written from your logbook tasks only.</w:t>
+      </w:r>
+    </w:p>
+    <w:p>
+      <w:pPr>
+        <w:pStyle w:val="ListBullet"/>
+        <w:spacing w:after="160"/>
+      </w:pPr>
+      <w:r>
+        <w:rPr>
+          <w:rFonts w:ascii="Times New Roman" w:hAnsi="Times New Roman" w:eastAsia="Times New Roman"/>
+          <w:b w:val="0"/>
+          <w:i w:val="0"/>
+          <w:color w:val="000000"/>
+          <w:sz w:val="24"/>
+        </w:rPr>
+        <w:t>Attendance self-declaration: 15 July 2026 = uninformed leave (absent, did not notify). 30 September 2026 = did not join a scheduled meeting (will accept consequences). Do not mark those dates as present.</w:t>
+      </w:r>
+    </w:p>
+    <w:p>
+      <w:pPr>
+        <w:pStyle w:val="Heading1"/>
+      </w:pPr>
+      <w:r>
+        <w:t>9. ATTENDANCE SELF-DECLARATION</w:t>
+      </w:r>
+    </w:p>
+    <w:p>
+      <w:r>
+        <w:rPr>
+          <w:rFonts w:ascii="Times New Roman" w:hAnsi="Times New Roman" w:eastAsia="Times New Roman"/>
+          <w:b w:val="0"/>
+          <w:i/>
+          <w:color w:val="000000"/>
+          <w:sz w:val="24"/>
+        </w:rPr>
+        <w:t>This table is completed by the student. It is not a company signature. Supervisors may add remarks and apply consequences.</w:t>
+      </w:r>
+    </w:p>
+    <w:tbl>
+      <w:tblPr>
+        <w:tblStyle w:val="TableGrid"/>
+        <w:tblW w:type="auto" w:w="0"/>
+        <w:tblLook w:firstColumn="1" w:firstRow="1" w:lastColumn="0" w:lastRow="0" w:noHBand="0" w:noVBand="1" w:val="04A0"/>
+      </w:tblPr>
+      <w:tblGrid>
+        <w:gridCol w:w="2268"/>
+        <w:gridCol w:w="2268"/>
+        <w:gridCol w:w="2268"/>
+        <w:gridCol w:w="2268"/>
+      </w:tblGrid>
+      <w:tr>
+        <w:tc>
+          <w:tcPr>
+            <w:tcW w:type="dxa" w:w="2268"/>
+          </w:tcPr>
+          <w:p>
+            <w:r/>
+            <w:r>
+              <w:rPr>
+                <w:rFonts w:ascii="Times New Roman" w:hAnsi="Times New Roman" w:eastAsia="Times New Roman"/>
+                <w:b/>
+                <w:i w:val="0"/>
+                <w:color w:val="000000"/>
+                <w:sz w:val="22"/>
+              </w:rPr>
+              <w:t>Date</w:t>
+            </w:r>
+          </w:p>
+        </w:tc>
+        <w:tc>
+          <w:tcPr>
+            <w:tcW w:type="dxa" w:w="2268"/>
+          </w:tcPr>
+          <w:p>
+            <w:r/>
+            <w:r>
+              <w:rPr>
+                <w:rFonts w:ascii="Times New Roman" w:hAnsi="Times New Roman" w:eastAsia="Times New Roman"/>
+                <w:b/>
+                <w:i w:val="0"/>
+                <w:color w:val="000000"/>
+                <w:sz w:val="22"/>
+              </w:rPr>
+              <w:t>Issue</w:t>
+            </w:r>
+          </w:p>
+        </w:tc>
+        <w:tc>
+          <w:tcPr>
+            <w:tcW w:type="dxa" w:w="2268"/>
+          </w:tcPr>
+          <w:p>
+            <w:r/>
+            <w:r>
+              <w:rPr>
+                <w:rFonts w:ascii="Times New Roman" w:hAnsi="Times New Roman" w:eastAsia="Times New Roman"/>
+                <w:b/>
+                <w:i w:val="0"/>
+                <w:color w:val="000000"/>
+                <w:sz w:val="22"/>
+              </w:rPr>
+              <w:t>Notification given?</w:t>
+            </w:r>
+          </w:p>
+        </w:tc>
+        <w:tc>
+          <w:tcPr>
+            <w:tcW w:type="dxa" w:w="2268"/>
+          </w:tcPr>
+          <w:p>
+            <w:r/>
+            <w:r>
+              <w:rPr>
+                <w:rFonts w:ascii="Times New Roman" w:hAnsi="Times New Roman" w:eastAsia="Times New Roman"/>
+                <w:b/>
+                <w:i w:val="0"/>
+                <w:color w:val="000000"/>
+                <w:sz w:val="22"/>
+              </w:rPr>
+              <w:t>Student declaration</w:t>
+            </w:r>
+          </w:p>
+        </w:tc>
+      </w:tr>
+      <w:tr>
+        <w:tc>
+          <w:tcPr>
+            <w:tcW w:type="dxa" w:w="2268"/>
+          </w:tcPr>
+          <w:p>
+            <w:r/>
+            <w:r>
+              <w:rPr>
+                <w:rFonts w:ascii="Times New Roman" w:hAnsi="Times New Roman" w:eastAsia="Times New Roman"/>
+                <w:b w:val="0"/>
+                <w:i w:val="0"/>
+                <w:color w:val="000000"/>
+                <w:sz w:val="22"/>
+              </w:rPr>
+              <w:t>15 July 2026</w:t>
+            </w:r>
+          </w:p>
+        </w:tc>
+        <w:tc>
+          <w:tcPr>
+            <w:tcW w:type="dxa" w:w="2268"/>
+          </w:tcPr>
+          <w:p>
+            <w:r/>
+            <w:r>
+              <w:rPr>
+                <w:rFonts w:ascii="Times New Roman" w:hAnsi="Times New Roman" w:eastAsia="Times New Roman"/>
+                <w:b w:val="0"/>
+                <w:i w:val="0"/>
+                <w:color w:val="000000"/>
+                <w:sz w:val="22"/>
+              </w:rPr>
+              <w:t>Took leave / was absent from internship duty</w:t>
+            </w:r>
+          </w:p>
+        </w:tc>
+        <w:tc>
+          <w:tcPr>
+            <w:tcW w:type="dxa" w:w="2268"/>
+          </w:tcPr>
+          <w:p>
+            <w:r/>
+            <w:r>
+              <w:rPr>
+                <w:rFonts w:ascii="Times New Roman" w:hAnsi="Times New Roman" w:eastAsia="Times New Roman"/>
+                <w:b w:val="0"/>
+                <w:i w:val="0"/>
+                <w:color w:val="000000"/>
+                <w:sz w:val="22"/>
+              </w:rPr>
+              <w:t>No. I did not inform my supervisor or the company before or during the day.</w:t>
+            </w:r>
+          </w:p>
+        </w:tc>
+        <w:tc>
+          <w:tcPr>
+            <w:tcW w:type="dxa" w:w="2268"/>
+          </w:tcPr>
+          <w:p>
+            <w:r/>
+            <w:r>
+              <w:rPr>
+                <w:rFonts w:ascii="Times New Roman" w:hAnsi="Times New Roman" w:eastAsia="Times New Roman"/>
+                <w:b w:val="0"/>
+                <w:i w:val="0"/>
+                <w:color w:val="000000"/>
+                <w:sz w:val="22"/>
+              </w:rPr>
+              <w:t>Unauthorised / uninformed absence. Poor performance. I accept consequences.</w:t>
+            </w:r>
+          </w:p>
+        </w:tc>
+      </w:tr>
+      <w:tr>
+        <w:tc>
+          <w:tcPr>
+            <w:tcW w:type="dxa" w:w="2268"/>
+          </w:tcPr>
+          <w:p>
+            <w:r/>
+            <w:r>
+              <w:rPr>
+                <w:rFonts w:ascii="Times New Roman" w:hAnsi="Times New Roman" w:eastAsia="Times New Roman"/>
+                <w:b w:val="0"/>
+                <w:i w:val="0"/>
+                <w:color w:val="000000"/>
+                <w:sz w:val="22"/>
+              </w:rPr>
+              <w:t>30 September 2026</w:t>
+            </w:r>
+          </w:p>
+        </w:tc>
+        <w:tc>
+          <w:tcPr>
+            <w:tcW w:type="dxa" w:w="2268"/>
+          </w:tcPr>
+          <w:p>
+            <w:r/>
+            <w:r>
+              <w:rPr>
+                <w:rFonts w:ascii="Times New Roman" w:hAnsi="Times New Roman" w:eastAsia="Times New Roman"/>
+                <w:b w:val="0"/>
+                <w:i w:val="0"/>
+                <w:color w:val="000000"/>
+                <w:sz w:val="22"/>
+              </w:rPr>
+              <w:t>Did not join a scheduled meeting</w:t>
+            </w:r>
+          </w:p>
+        </w:tc>
+        <w:tc>
+          <w:tcPr>
+            <w:tcW w:type="dxa" w:w="2268"/>
+          </w:tcPr>
+          <w:p>
+            <w:r/>
+            <w:r>
+              <w:rPr>
+                <w:rFonts w:ascii="Times New Roman" w:hAnsi="Times New Roman" w:eastAsia="Times New Roman"/>
+                <w:b w:val="0"/>
+                <w:i w:val="0"/>
+                <w:color w:val="000000"/>
+                <w:sz w:val="22"/>
+              </w:rPr>
+              <w:t>No. I did not attend and did not send notice that I would miss it.</w:t>
+            </w:r>
+          </w:p>
+        </w:tc>
+        <w:tc>
+          <w:tcPr>
+            <w:tcW w:type="dxa" w:w="2268"/>
+          </w:tcPr>
+          <w:p>
+            <w:r/>
+            <w:r>
+              <w:rPr>
+                <w:rFonts w:ascii="Times New Roman" w:hAnsi="Times New Roman" w:eastAsia="Times New Roman"/>
+                <w:b w:val="0"/>
+                <w:i w:val="0"/>
+                <w:color w:val="000000"/>
+                <w:sz w:val="22"/>
+              </w:rPr>
+              <w:t>Failure to attend a meeting. Poor performance. I will face the consequences.</w:t>
+            </w:r>
+          </w:p>
+        </w:tc>
+      </w:tr>
+      <w:tr>
+        <w:tc>
+          <w:tcPr>
+            <w:tcW w:type="dxa" w:w="2268"/>
+          </w:tcPr>
+          <w:p>
+            <w:r/>
+            <w:r>
+              <w:rPr>
+                <w:rFonts w:ascii="Times New Roman" w:hAnsi="Times New Roman" w:eastAsia="Times New Roman"/>
+                <w:b w:val="0"/>
+                <w:i w:val="0"/>
+                <w:color w:val="000000"/>
+                <w:sz w:val="22"/>
+              </w:rPr>
+              <w:t>Other working days in logbook weeks</w:t>
+            </w:r>
+          </w:p>
+        </w:tc>
+        <w:tc>
+          <w:tcPr>
+            <w:tcW w:type="dxa" w:w="2268"/>
+          </w:tcPr>
+          <w:p>
+            <w:r/>
+            <w:r>
+              <w:rPr>
+                <w:rFonts w:ascii="Times New Roman" w:hAnsi="Times New Roman" w:eastAsia="Times New Roman"/>
+                <w:b w:val="0"/>
+                <w:i w:val="0"/>
+                <w:color w:val="000000"/>
+                <w:sz w:val="22"/>
+              </w:rPr>
+              <w:t>Work as recorded in Weeks 2–11</w:t>
+            </w:r>
+          </w:p>
+        </w:tc>
+        <w:tc>
+          <w:tcPr>
+            <w:tcW w:type="dxa" w:w="2268"/>
+          </w:tcPr>
+          <w:p>
+            <w:r/>
+            <w:r>
+              <w:rPr>
+                <w:rFonts w:ascii="Times New Roman" w:hAnsi="Times New Roman" w:eastAsia="Times New Roman"/>
+                <w:b w:val="0"/>
+                <w:i w:val="0"/>
+                <w:color w:val="000000"/>
+                <w:sz w:val="22"/>
+              </w:rPr>
+              <w:t>Normal reporting via logbook / team chat as applicable</w:t>
+            </w:r>
+          </w:p>
+        </w:tc>
+        <w:tc>
+          <w:tcPr>
+            <w:tcW w:type="dxa" w:w="2268"/>
+          </w:tcPr>
+          <w:p>
+            <w:r/>
+            <w:r>
+              <w:rPr>
+                <w:rFonts w:ascii="Times New Roman" w:hAnsi="Times New Roman" w:eastAsia="Times New Roman"/>
+                <w:b w:val="0"/>
+                <w:i w:val="0"/>
+                <w:color w:val="000000"/>
+                <w:sz w:val="22"/>
+              </w:rPr>
+              <w:t>Present according to logbooks, subject to company attendance records.</w:t>
+            </w:r>
+          </w:p>
+        </w:tc>
+      </w:tr>
+    </w:tbl>
+    <w:p>
+      <w:r>
+        <w:rPr>
+          <w:rFonts w:ascii="Times New Roman" w:hAnsi="Times New Roman" w:eastAsia="Times New Roman"/>
+          <w:b w:val="0"/>
+          <w:i w:val="0"/>
+          <w:color w:val="000000"/>
+          <w:sz w:val="24"/>
+        </w:rPr>
+        <w:t>Student signature: ________________________     Date: ______________     Supervisor remarks / consequences: ________________________________________________</w:t>
       </w:r>
     </w:p>
     <w:sectPr>

</xml_diff>